<commit_message>
Fix Table 4.2 to match Chapter 3 Table 3.4 stratification (5 strata, n=1300)
</commit_message>
<xml_diff>
--- a/Chapter_4_Data_Analysis.docx
+++ b/Chapter_4_Data_Analysis.docx
@@ -606,7 +606,7 @@
       <w:tr>
         <w:tc>
           <w:tcPr>
-            <w:tcW w:type="dxa" w:w="3744"/>
+            <w:tcW w:type="dxa" w:w="3120"/>
           </w:tcPr>
           <w:p>
             <w:pPr>
@@ -626,41 +626,41 @@
         </w:tc>
         <w:tc>
           <w:tcPr>
-            <w:tcW w:type="dxa" w:w="2016"/>
-          </w:tcPr>
-          <w:p>
-            <w:pPr>
-              <w:jc w:val="center"/>
-            </w:pPr>
-            <w:r/>
-            <w:r>
-              <w:rPr>
-                <w:rFonts w:ascii="Times New Roman" w:hAnsi="Times New Roman" w:cs="Times New Roman"/>
-                <w:b w:val="0"/>
-                <w:i w:val="0"/>
-                <w:sz w:val="22"/>
-              </w:rPr>
-              <w:t>650</w:t>
-            </w:r>
-          </w:p>
-        </w:tc>
-        <w:tc>
-          <w:tcPr>
-            <w:tcW w:type="dxa" w:w="1728"/>
-          </w:tcPr>
-          <w:p>
-            <w:pPr>
-              <w:jc w:val="center"/>
-            </w:pPr>
-            <w:r/>
-            <w:r>
-              <w:rPr>
-                <w:rFonts w:ascii="Times New Roman" w:hAnsi="Times New Roman" w:cs="Times New Roman"/>
-                <w:b w:val="0"/>
-                <w:i w:val="0"/>
-                <w:sz w:val="22"/>
-              </w:rPr>
-              <w:t>50.0</w:t>
+            <w:tcW w:type="dxa" w:w="3120"/>
+          </w:tcPr>
+          <w:p>
+            <w:pPr>
+              <w:jc w:val="center"/>
+            </w:pPr>
+            <w:r/>
+            <w:r>
+              <w:rPr>
+                <w:rFonts w:ascii="Times New Roman" w:hAnsi="Times New Roman" w:cs="Times New Roman"/>
+                <w:b w:val="0"/>
+                <w:i w:val="0"/>
+                <w:sz w:val="22"/>
+              </w:rPr>
+              <w:t>540</w:t>
+            </w:r>
+          </w:p>
+        </w:tc>
+        <w:tc>
+          <w:tcPr>
+            <w:tcW w:type="dxa" w:w="3120"/>
+          </w:tcPr>
+          <w:p>
+            <w:pPr>
+              <w:jc w:val="center"/>
+            </w:pPr>
+            <w:r/>
+            <w:r>
+              <w:rPr>
+                <w:rFonts w:ascii="Times New Roman" w:hAnsi="Times New Roman" w:cs="Times New Roman"/>
+                <w:b w:val="0"/>
+                <w:i w:val="0"/>
+                <w:sz w:val="22"/>
+              </w:rPr>
+              <w:t>41.5</w:t>
             </w:r>
           </w:p>
         </w:tc>
@@ -668,7 +668,7 @@
       <w:tr>
         <w:tc>
           <w:tcPr>
-            <w:tcW w:type="dxa" w:w="3744"/>
+            <w:tcW w:type="dxa" w:w="3120"/>
           </w:tcPr>
           <w:p>
             <w:pPr>
@@ -682,47 +682,47 @@
                 <w:i w:val="0"/>
                 <w:sz w:val="22"/>
               </w:rPr>
-              <w:t>Wholesalers</w:t>
-            </w:r>
-          </w:p>
-        </w:tc>
-        <w:tc>
-          <w:tcPr>
-            <w:tcW w:type="dxa" w:w="2016"/>
-          </w:tcPr>
-          <w:p>
-            <w:pPr>
-              <w:jc w:val="center"/>
-            </w:pPr>
-            <w:r/>
-            <w:r>
-              <w:rPr>
-                <w:rFonts w:ascii="Times New Roman" w:hAnsi="Times New Roman" w:cs="Times New Roman"/>
-                <w:b w:val="0"/>
-                <w:i w:val="0"/>
-                <w:sz w:val="22"/>
-              </w:rPr>
-              <w:t>130</w:t>
-            </w:r>
-          </w:p>
-        </w:tc>
-        <w:tc>
-          <w:tcPr>
-            <w:tcW w:type="dxa" w:w="1728"/>
-          </w:tcPr>
-          <w:p>
-            <w:pPr>
-              <w:jc w:val="center"/>
-            </w:pPr>
-            <w:r/>
-            <w:r>
-              <w:rPr>
-                <w:rFonts w:ascii="Times New Roman" w:hAnsi="Times New Roman" w:cs="Times New Roman"/>
-                <w:b w:val="0"/>
-                <w:i w:val="0"/>
-                <w:sz w:val="22"/>
-              </w:rPr>
-              <w:t>10.0</w:t>
+              <w:t>Local Traders / Commission Agents</w:t>
+            </w:r>
+          </w:p>
+        </w:tc>
+        <w:tc>
+          <w:tcPr>
+            <w:tcW w:type="dxa" w:w="3120"/>
+          </w:tcPr>
+          <w:p>
+            <w:pPr>
+              <w:jc w:val="center"/>
+            </w:pPr>
+            <w:r/>
+            <w:r>
+              <w:rPr>
+                <w:rFonts w:ascii="Times New Roman" w:hAnsi="Times New Roman" w:cs="Times New Roman"/>
+                <w:b w:val="0"/>
+                <w:i w:val="0"/>
+                <w:sz w:val="22"/>
+              </w:rPr>
+              <w:t>220</w:t>
+            </w:r>
+          </w:p>
+        </w:tc>
+        <w:tc>
+          <w:tcPr>
+            <w:tcW w:type="dxa" w:w="3120"/>
+          </w:tcPr>
+          <w:p>
+            <w:pPr>
+              <w:jc w:val="center"/>
+            </w:pPr>
+            <w:r/>
+            <w:r>
+              <w:rPr>
+                <w:rFonts w:ascii="Times New Roman" w:hAnsi="Times New Roman" w:cs="Times New Roman"/>
+                <w:b w:val="0"/>
+                <w:i w:val="0"/>
+                <w:sz w:val="22"/>
+              </w:rPr>
+              <w:t>16.9</w:t>
             </w:r>
           </w:p>
         </w:tc>
@@ -730,7 +730,7 @@
       <w:tr>
         <w:tc>
           <w:tcPr>
-            <w:tcW w:type="dxa" w:w="3744"/>
+            <w:tcW w:type="dxa" w:w="3120"/>
           </w:tcPr>
           <w:p>
             <w:pPr>
@@ -744,47 +744,47 @@
                 <w:i w:val="0"/>
                 <w:sz w:val="22"/>
               </w:rPr>
-              <w:t>Transporters</w:t>
-            </w:r>
-          </w:p>
-        </w:tc>
-        <w:tc>
-          <w:tcPr>
-            <w:tcW w:type="dxa" w:w="2016"/>
-          </w:tcPr>
-          <w:p>
-            <w:pPr>
-              <w:jc w:val="center"/>
-            </w:pPr>
-            <w:r/>
-            <w:r>
-              <w:rPr>
-                <w:rFonts w:ascii="Times New Roman" w:hAnsi="Times New Roman" w:cs="Times New Roman"/>
-                <w:b w:val="0"/>
-                <w:i w:val="0"/>
-                <w:sz w:val="22"/>
-              </w:rPr>
-              <w:t>130</w:t>
-            </w:r>
-          </w:p>
-        </w:tc>
-        <w:tc>
-          <w:tcPr>
-            <w:tcW w:type="dxa" w:w="1728"/>
-          </w:tcPr>
-          <w:p>
-            <w:pPr>
-              <w:jc w:val="center"/>
-            </w:pPr>
-            <w:r/>
-            <w:r>
-              <w:rPr>
-                <w:rFonts w:ascii="Times New Roman" w:hAnsi="Times New Roman" w:cs="Times New Roman"/>
-                <w:b w:val="0"/>
-                <w:i w:val="0"/>
-                <w:sz w:val="22"/>
-              </w:rPr>
-              <w:t>10.0</w:t>
+              <w:t>Wholesale / Mandi Agents</w:t>
+            </w:r>
+          </w:p>
+        </w:tc>
+        <w:tc>
+          <w:tcPr>
+            <w:tcW w:type="dxa" w:w="3120"/>
+          </w:tcPr>
+          <w:p>
+            <w:pPr>
+              <w:jc w:val="center"/>
+            </w:pPr>
+            <w:r/>
+            <w:r>
+              <w:rPr>
+                <w:rFonts w:ascii="Times New Roman" w:hAnsi="Times New Roman" w:cs="Times New Roman"/>
+                <w:b w:val="0"/>
+                <w:i w:val="0"/>
+                <w:sz w:val="22"/>
+              </w:rPr>
+              <w:t>180</w:t>
+            </w:r>
+          </w:p>
+        </w:tc>
+        <w:tc>
+          <w:tcPr>
+            <w:tcW w:type="dxa" w:w="3120"/>
+          </w:tcPr>
+          <w:p>
+            <w:pPr>
+              <w:jc w:val="center"/>
+            </w:pPr>
+            <w:r/>
+            <w:r>
+              <w:rPr>
+                <w:rFonts w:ascii="Times New Roman" w:hAnsi="Times New Roman" w:cs="Times New Roman"/>
+                <w:b w:val="0"/>
+                <w:i w:val="0"/>
+                <w:sz w:val="22"/>
+              </w:rPr>
+              <w:t>13.8</w:t>
             </w:r>
           </w:p>
         </w:tc>
@@ -792,7 +792,7 @@
       <w:tr>
         <w:tc>
           <w:tcPr>
-            <w:tcW w:type="dxa" w:w="3744"/>
+            <w:tcW w:type="dxa" w:w="3120"/>
           </w:tcPr>
           <w:p>
             <w:pPr>
@@ -812,41 +812,41 @@
         </w:tc>
         <w:tc>
           <w:tcPr>
-            <w:tcW w:type="dxa" w:w="2016"/>
-          </w:tcPr>
-          <w:p>
-            <w:pPr>
-              <w:jc w:val="center"/>
-            </w:pPr>
-            <w:r/>
-            <w:r>
-              <w:rPr>
-                <w:rFonts w:ascii="Times New Roman" w:hAnsi="Times New Roman" w:cs="Times New Roman"/>
-                <w:b w:val="0"/>
-                <w:i w:val="0"/>
-                <w:sz w:val="22"/>
-              </w:rPr>
-              <w:t>130</w:t>
-            </w:r>
-          </w:p>
-        </w:tc>
-        <w:tc>
-          <w:tcPr>
-            <w:tcW w:type="dxa" w:w="1728"/>
-          </w:tcPr>
-          <w:p>
-            <w:pPr>
-              <w:jc w:val="center"/>
-            </w:pPr>
-            <w:r/>
-            <w:r>
-              <w:rPr>
-                <w:rFonts w:ascii="Times New Roman" w:hAnsi="Times New Roman" w:cs="Times New Roman"/>
-                <w:b w:val="0"/>
-                <w:i w:val="0"/>
-                <w:sz w:val="22"/>
-              </w:rPr>
-              <w:t>10.0</w:t>
+            <w:tcW w:type="dxa" w:w="3120"/>
+          </w:tcPr>
+          <w:p>
+            <w:pPr>
+              <w:jc w:val="center"/>
+            </w:pPr>
+            <w:r/>
+            <w:r>
+              <w:rPr>
+                <w:rFonts w:ascii="Times New Roman" w:hAnsi="Times New Roman" w:cs="Times New Roman"/>
+                <w:b w:val="0"/>
+                <w:i w:val="0"/>
+                <w:sz w:val="22"/>
+              </w:rPr>
+              <w:t>230</w:t>
+            </w:r>
+          </w:p>
+        </w:tc>
+        <w:tc>
+          <w:tcPr>
+            <w:tcW w:type="dxa" w:w="3120"/>
+          </w:tcPr>
+          <w:p>
+            <w:pPr>
+              <w:jc w:val="center"/>
+            </w:pPr>
+            <w:r/>
+            <w:r>
+              <w:rPr>
+                <w:rFonts w:ascii="Times New Roman" w:hAnsi="Times New Roman" w:cs="Times New Roman"/>
+                <w:b w:val="0"/>
+                <w:i w:val="0"/>
+                <w:sz w:val="22"/>
+              </w:rPr>
+              <w:t>17.7</w:t>
             </w:r>
           </w:p>
         </w:tc>
@@ -854,7 +854,7 @@
       <w:tr>
         <w:tc>
           <w:tcPr>
-            <w:tcW w:type="dxa" w:w="3744"/>
+            <w:tcW w:type="dxa" w:w="3120"/>
           </w:tcPr>
           <w:p>
             <w:pPr>
@@ -868,47 +868,47 @@
                 <w:i w:val="0"/>
                 <w:sz w:val="22"/>
               </w:rPr>
-              <w:t>Village Traders</w:t>
-            </w:r>
-          </w:p>
-        </w:tc>
-        <w:tc>
-          <w:tcPr>
-            <w:tcW w:type="dxa" w:w="2016"/>
-          </w:tcPr>
-          <w:p>
-            <w:pPr>
-              <w:jc w:val="center"/>
-            </w:pPr>
-            <w:r/>
-            <w:r>
-              <w:rPr>
-                <w:rFonts w:ascii="Times New Roman" w:hAnsi="Times New Roman" w:cs="Times New Roman"/>
-                <w:b w:val="0"/>
-                <w:i w:val="0"/>
-                <w:sz w:val="22"/>
-              </w:rPr>
-              <w:t>117</w:t>
-            </w:r>
-          </w:p>
-        </w:tc>
-        <w:tc>
-          <w:tcPr>
-            <w:tcW w:type="dxa" w:w="1728"/>
-          </w:tcPr>
-          <w:p>
-            <w:pPr>
-              <w:jc w:val="center"/>
-            </w:pPr>
-            <w:r/>
-            <w:r>
-              <w:rPr>
-                <w:rFonts w:ascii="Times New Roman" w:hAnsi="Times New Roman" w:cs="Times New Roman"/>
-                <w:b w:val="0"/>
-                <w:i w:val="0"/>
-                <w:sz w:val="22"/>
-              </w:rPr>
-              <w:t>9.0</w:t>
+              <w:t>Transporters</w:t>
+            </w:r>
+          </w:p>
+        </w:tc>
+        <w:tc>
+          <w:tcPr>
+            <w:tcW w:type="dxa" w:w="3120"/>
+          </w:tcPr>
+          <w:p>
+            <w:pPr>
+              <w:jc w:val="center"/>
+            </w:pPr>
+            <w:r/>
+            <w:r>
+              <w:rPr>
+                <w:rFonts w:ascii="Times New Roman" w:hAnsi="Times New Roman" w:cs="Times New Roman"/>
+                <w:b w:val="0"/>
+                <w:i w:val="0"/>
+                <w:sz w:val="22"/>
+              </w:rPr>
+              <w:t>130</w:t>
+            </w:r>
+          </w:p>
+        </w:tc>
+        <w:tc>
+          <w:tcPr>
+            <w:tcW w:type="dxa" w:w="3120"/>
+          </w:tcPr>
+          <w:p>
+            <w:pPr>
+              <w:jc w:val="center"/>
+            </w:pPr>
+            <w:r/>
+            <w:r>
+              <w:rPr>
+                <w:rFonts w:ascii="Times New Roman" w:hAnsi="Times New Roman" w:cs="Times New Roman"/>
+                <w:b w:val="0"/>
+                <w:i w:val="0"/>
+                <w:sz w:val="22"/>
+              </w:rPr>
+              <w:t>10.0</w:t>
             </w:r>
           </w:p>
         </w:tc>
@@ -916,7 +916,7 @@
       <w:tr>
         <w:tc>
           <w:tcPr>
-            <w:tcW w:type="dxa" w:w="3744"/>
+            <w:tcW w:type="dxa" w:w="3120"/>
           </w:tcPr>
           <w:p>
             <w:pPr>
@@ -926,131 +926,7 @@
             <w:r>
               <w:rPr>
                 <w:rFonts w:ascii="Times New Roman" w:hAnsi="Times New Roman" w:cs="Times New Roman"/>
-                <w:b w:val="0"/>
-                <w:i w:val="0"/>
-                <w:sz w:val="22"/>
-              </w:rPr>
-              <w:t>Commission Agents</w:t>
-            </w:r>
-          </w:p>
-        </w:tc>
-        <w:tc>
-          <w:tcPr>
-            <w:tcW w:type="dxa" w:w="2016"/>
-          </w:tcPr>
-          <w:p>
-            <w:pPr>
-              <w:jc w:val="center"/>
-            </w:pPr>
-            <w:r/>
-            <w:r>
-              <w:rPr>
-                <w:rFonts w:ascii="Times New Roman" w:hAnsi="Times New Roman" w:cs="Times New Roman"/>
-                <w:b w:val="0"/>
-                <w:i w:val="0"/>
-                <w:sz w:val="22"/>
-              </w:rPr>
-              <w:t>78</w:t>
-            </w:r>
-          </w:p>
-        </w:tc>
-        <w:tc>
-          <w:tcPr>
-            <w:tcW w:type="dxa" w:w="1728"/>
-          </w:tcPr>
-          <w:p>
-            <w:pPr>
-              <w:jc w:val="center"/>
-            </w:pPr>
-            <w:r/>
-            <w:r>
-              <w:rPr>
-                <w:rFonts w:ascii="Times New Roman" w:hAnsi="Times New Roman" w:cs="Times New Roman"/>
-                <w:b w:val="0"/>
-                <w:i w:val="0"/>
-                <w:sz w:val="22"/>
-              </w:rPr>
-              <w:t>6.0</w:t>
-            </w:r>
-          </w:p>
-        </w:tc>
-      </w:tr>
-      <w:tr>
-        <w:tc>
-          <w:tcPr>
-            <w:tcW w:type="dxa" w:w="3744"/>
-          </w:tcPr>
-          <w:p>
-            <w:pPr>
-              <w:jc w:val="left"/>
-            </w:pPr>
-            <w:r/>
-            <w:r>
-              <w:rPr>
-                <w:rFonts w:ascii="Times New Roman" w:hAnsi="Times New Roman" w:cs="Times New Roman"/>
-                <w:b w:val="0"/>
-                <w:i w:val="0"/>
-                <w:sz w:val="22"/>
-              </w:rPr>
-              <w:t>Experts / Officials</w:t>
-            </w:r>
-          </w:p>
-        </w:tc>
-        <w:tc>
-          <w:tcPr>
-            <w:tcW w:type="dxa" w:w="2016"/>
-          </w:tcPr>
-          <w:p>
-            <w:pPr>
-              <w:jc w:val="center"/>
-            </w:pPr>
-            <w:r/>
-            <w:r>
-              <w:rPr>
-                <w:rFonts w:ascii="Times New Roman" w:hAnsi="Times New Roman" w:cs="Times New Roman"/>
-                <w:b w:val="0"/>
-                <w:i w:val="0"/>
-                <w:sz w:val="22"/>
-              </w:rPr>
-              <w:t>65</w:t>
-            </w:r>
-          </w:p>
-        </w:tc>
-        <w:tc>
-          <w:tcPr>
-            <w:tcW w:type="dxa" w:w="1728"/>
-          </w:tcPr>
-          <w:p>
-            <w:pPr>
-              <w:jc w:val="center"/>
-            </w:pPr>
-            <w:r/>
-            <w:r>
-              <w:rPr>
-                <w:rFonts w:ascii="Times New Roman" w:hAnsi="Times New Roman" w:cs="Times New Roman"/>
-                <w:b w:val="0"/>
-                <w:i w:val="0"/>
-                <w:sz w:val="22"/>
-              </w:rPr>
-              <w:t>5.0</w:t>
-            </w:r>
-          </w:p>
-        </w:tc>
-      </w:tr>
-      <w:tr>
-        <w:tc>
-          <w:tcPr>
-            <w:tcW w:type="dxa" w:w="3744"/>
-          </w:tcPr>
-          <w:p>
-            <w:pPr>
-              <w:jc w:val="left"/>
-            </w:pPr>
-            <w:r/>
-            <w:r>
-              <w:rPr>
-                <w:rFonts w:ascii="Times New Roman" w:hAnsi="Times New Roman" w:cs="Times New Roman"/>
-                <w:b w:val="0"/>
+                <w:b/>
                 <w:i w:val="0"/>
                 <w:sz w:val="22"/>
               </w:rPr>
@@ -1060,37 +936,37 @@
         </w:tc>
         <w:tc>
           <w:tcPr>
-            <w:tcW w:type="dxa" w:w="2016"/>
-          </w:tcPr>
-          <w:p>
-            <w:pPr>
-              <w:jc w:val="center"/>
-            </w:pPr>
-            <w:r/>
-            <w:r>
-              <w:rPr>
-                <w:rFonts w:ascii="Times New Roman" w:hAnsi="Times New Roman" w:cs="Times New Roman"/>
-                <w:b w:val="0"/>
-                <w:i w:val="0"/>
-                <w:sz w:val="22"/>
-              </w:rPr>
-              <w:t>1300</w:t>
-            </w:r>
-          </w:p>
-        </w:tc>
-        <w:tc>
-          <w:tcPr>
-            <w:tcW w:type="dxa" w:w="1728"/>
-          </w:tcPr>
-          <w:p>
-            <w:pPr>
-              <w:jc w:val="center"/>
-            </w:pPr>
-            <w:r/>
-            <w:r>
-              <w:rPr>
-                <w:rFonts w:ascii="Times New Roman" w:hAnsi="Times New Roman" w:cs="Times New Roman"/>
-                <w:b w:val="0"/>
+            <w:tcW w:type="dxa" w:w="3120"/>
+          </w:tcPr>
+          <w:p>
+            <w:pPr>
+              <w:jc w:val="center"/>
+            </w:pPr>
+            <w:r/>
+            <w:r>
+              <w:rPr>
+                <w:rFonts w:ascii="Times New Roman" w:hAnsi="Times New Roman" w:cs="Times New Roman"/>
+                <w:b/>
+                <w:i w:val="0"/>
+                <w:sz w:val="22"/>
+              </w:rPr>
+              <w:t>1,300</w:t>
+            </w:r>
+          </w:p>
+        </w:tc>
+        <w:tc>
+          <w:tcPr>
+            <w:tcW w:type="dxa" w:w="3120"/>
+          </w:tcPr>
+          <w:p>
+            <w:pPr>
+              <w:jc w:val="center"/>
+            </w:pPr>
+            <w:r/>
+            <w:r>
+              <w:rPr>
+                <w:rFonts w:ascii="Times New Roman" w:hAnsi="Times New Roman" w:cs="Times New Roman"/>
+                <w:b/>
                 <w:i w:val="0"/>
                 <w:sz w:val="22"/>
               </w:rPr>
@@ -2284,7 +2160,7 @@
           <w:i w:val="0"/>
           <w:sz w:val="24"/>
         </w:rPr>
-        <w:t>The geographic spread is approximately balanced across the four mid-hill districts, each contributing between 23.9% and 26.2% of the sample. Farmers form the single largest stratum at 50%, with the remaining half distributed across downstream actors. Almost three-quarters of the respondents fall in the 36-and-above bracket and around three-fifths report more than ten years of experience in Malta cultivation or trading. This is a deliberately experience-heavy sample, since the criteria being rated relate to operational criticality and respondents with longer field exposure are better placed to judge them.</w:t>
+        <w:t>The geographic spread is approximately balanced across the four mid-hill districts, each contributing between 23.9% and 26.2% of the sample. Farmers form the single largest stratum at 41.5%, with the remaining 58.5% distributed across local traders and commission agents (16.9%), retailers (17.7%), wholesale / mandi agents (13.8%) and transporters (10.0%). This stratification follows verbatim the design reported in Table 3.4 of Chapter 3 and reflects the proportionate-to-size logic adopted for the stratified random sample. Almost three-quarters of the respondents fall in the 36-and-above bracket and around three-fifths report more than ten years of experience in Malta cultivation or trading. This is a deliberately experience-heavy sample, since the criteria being rated relate to operational criticality and respondents with longer field exposure are better placed to judge them.</w:t>
       </w:r>
     </w:p>
     <w:p>

</xml_diff>